<commit_message>
Added Fleurs Test Data + Began concept of adding in short inputs to training data
</commit_message>
<xml_diff>
--- a/Capstone_ProjectPlan.docx
+++ b/Capstone_ProjectPlan.docx
@@ -42,20 +42,6 @@
           <w:rFonts w:ascii="Times New Roman" w:hAnsi="Times New Roman" w:cs="Times New Roman"/>
         </w:rPr>
         <w:t xml:space="preserve">INFO 698 </w:t>
-      </w:r>
-    </w:p>
-    <w:p>
-      <w:pPr>
-        <w:spacing w:line="480" w:lineRule="auto"/>
-        <w:rPr>
-          <w:rFonts w:ascii="Times New Roman" w:hAnsi="Times New Roman" w:cs="Times New Roman"/>
-        </w:rPr>
-      </w:pPr>
-      <w:r>
-        <w:rPr>
-          <w:rFonts w:ascii="Times New Roman" w:hAnsi="Times New Roman" w:cs="Times New Roman"/>
-        </w:rPr>
-        <w:t>Greg Chism</w:t>
       </w:r>
     </w:p>
     <w:p>
@@ -136,7 +122,7 @@
         <w:rPr>
           <w:rFonts w:ascii="Times New Roman" w:hAnsi="Times New Roman" w:cs="Times New Roman"/>
         </w:rPr>
-        <w:t xml:space="preserve"> Whisper(-small) for transcription and another model for translation while potentially building my own model such as an </w:t>
+        <w:t xml:space="preserve"> Whisper(-small) for transcription and another model for translation while building my own model such as an </w:t>
       </w:r>
       <w:proofErr w:type="spellStart"/>
       <w:r>
@@ -150,7 +136,7 @@
         <w:rPr>
           <w:rFonts w:ascii="Times New Roman" w:hAnsi="Times New Roman" w:cs="Times New Roman"/>
         </w:rPr>
-        <w:t xml:space="preserve"> or </w:t>
+        <w:t xml:space="preserve">, </w:t>
       </w:r>
       <w:proofErr w:type="spellStart"/>
       <w:r>
@@ -164,7 +150,19 @@
         <w:rPr>
           <w:rFonts w:ascii="Times New Roman" w:hAnsi="Times New Roman" w:cs="Times New Roman"/>
         </w:rPr>
-        <w:t xml:space="preserve"> for the language detection to decide which datasets to use from </w:t>
+        <w:t xml:space="preserve"> or a Neural Network</w:t>
+      </w:r>
+      <w:r>
+        <w:rPr>
+          <w:rFonts w:ascii="Times New Roman" w:hAnsi="Times New Roman" w:cs="Times New Roman"/>
+        </w:rPr>
+        <w:t xml:space="preserve"> for the language detection </w:t>
+      </w:r>
+      <w:r>
+        <w:rPr>
+          <w:rFonts w:ascii="Times New Roman" w:hAnsi="Times New Roman" w:cs="Times New Roman"/>
+        </w:rPr>
+        <w:t xml:space="preserve">which will be trained the datasets from </w:t>
       </w:r>
       <w:proofErr w:type="spellStart"/>
       <w:r>
@@ -392,20 +390,28 @@
         </w:rPr>
         <w:t xml:space="preserve">to have it accurately transcribe it into text of the correct language. This initial phase will be a core data science competency for being able to think abstractly and decompose a </w:t>
       </w:r>
-      <w:proofErr w:type="gramStart"/>
-      <w:r>
-        <w:rPr>
-          <w:rFonts w:ascii="Times New Roman" w:hAnsi="Times New Roman" w:cs="Times New Roman"/>
-        </w:rPr>
-        <w:t>large scale</w:t>
-      </w:r>
-      <w:proofErr w:type="gramEnd"/>
+      <w:r>
+        <w:rPr>
+          <w:rFonts w:ascii="Times New Roman" w:hAnsi="Times New Roman" w:cs="Times New Roman"/>
+        </w:rPr>
+        <w:t>large-scale</w:t>
+      </w:r>
       <w:r>
         <w:rPr>
           <w:rFonts w:ascii="Times New Roman" w:hAnsi="Times New Roman" w:cs="Times New Roman"/>
         </w:rPr>
         <w:t xml:space="preserve"> project to build from scratch. </w:t>
       </w:r>
+    </w:p>
+    <w:p>
+      <w:pPr>
+        <w:spacing w:line="480" w:lineRule="auto"/>
+        <w:rPr>
+          <w:rFonts w:ascii="Times New Roman" w:hAnsi="Times New Roman" w:cs="Times New Roman"/>
+        </w:rPr>
+      </w:pPr>
+      <w:bookmarkStart w:id="0" w:name="_GoBack"/>
+      <w:bookmarkEnd w:id="0"/>
     </w:p>
     <w:p>
       <w:pPr>
@@ -435,8 +441,6 @@
         </w:rPr>
         <w:t>6</w:t>
       </w:r>
-      <w:bookmarkStart w:id="0" w:name="_GoBack"/>
-      <w:bookmarkEnd w:id="0"/>
       <w:r>
         <w:rPr>
           <w:rFonts w:ascii="Times New Roman" w:hAnsi="Times New Roman" w:cs="Times New Roman"/>
@@ -498,7 +502,7 @@
         <w:rPr>
           <w:rFonts w:ascii="Times New Roman" w:hAnsi="Times New Roman" w:cs="Times New Roman"/>
         </w:rPr>
-        <w:t xml:space="preserve"> or </w:t>
+        <w:t xml:space="preserve">, </w:t>
       </w:r>
       <w:proofErr w:type="spellStart"/>
       <w:r>
@@ -512,7 +516,31 @@
         <w:rPr>
           <w:rFonts w:ascii="Times New Roman" w:hAnsi="Times New Roman" w:cs="Times New Roman"/>
         </w:rPr>
-        <w:t xml:space="preserve"> in order to give a probability of which language the text from the Step 1. Model transcription gives after being trained on </w:t>
+        <w:t xml:space="preserve"> </w:t>
+      </w:r>
+      <w:r>
+        <w:rPr>
+          <w:rFonts w:ascii="Times New Roman" w:hAnsi="Times New Roman" w:cs="Times New Roman"/>
+        </w:rPr>
+        <w:t xml:space="preserve">or Neural Network </w:t>
+      </w:r>
+      <w:r>
+        <w:rPr>
+          <w:rFonts w:ascii="Times New Roman" w:hAnsi="Times New Roman" w:cs="Times New Roman"/>
+        </w:rPr>
+        <w:t>in order to give a probability of which language the text from the Step 1</w:t>
+      </w:r>
+      <w:r>
+        <w:rPr>
+          <w:rFonts w:ascii="Times New Roman" w:hAnsi="Times New Roman" w:cs="Times New Roman"/>
+        </w:rPr>
+        <w:t xml:space="preserve"> is</w:t>
+      </w:r>
+      <w:r>
+        <w:rPr>
+          <w:rFonts w:ascii="Times New Roman" w:hAnsi="Times New Roman" w:cs="Times New Roman"/>
+        </w:rPr>
+        <w:t xml:space="preserve">. Model transcription gives after being trained on </w:t>
       </w:r>
       <w:proofErr w:type="spellStart"/>
       <w:r>
@@ -617,7 +645,19 @@
         <w:rPr>
           <w:rFonts w:ascii="Times New Roman" w:hAnsi="Times New Roman" w:cs="Times New Roman"/>
         </w:rPr>
-        <w:t xml:space="preserve">Make use of the final model to take the translated and language detected text from the models above and finally translate it to the desired language. This will require a pre-trained model and most likely some adjustments on my end to work smoothly for my final product. It showcases my ability to apply multiple complex models to work together and to be able to use powerful resources like </w:t>
+        <w:t>Make use of the final model to take the tran</w:t>
+      </w:r>
+      <w:r>
+        <w:rPr>
+          <w:rFonts w:ascii="Times New Roman" w:hAnsi="Times New Roman" w:cs="Times New Roman"/>
+        </w:rPr>
+        <w:t>scribed</w:t>
+      </w:r>
+      <w:r>
+        <w:rPr>
+          <w:rFonts w:ascii="Times New Roman" w:hAnsi="Times New Roman" w:cs="Times New Roman"/>
+        </w:rPr>
+        <w:t xml:space="preserve"> and language detected text from the models above and finally translate it to the desired language. This will require a pre-trained model and most likely some adjustments on my end to work smoothly for my final product. It showcases my ability to apply multiple complex models to work together and to be able to use powerful resources like </w:t>
       </w:r>
       <w:proofErr w:type="spellStart"/>
       <w:r>
@@ -631,7 +671,25 @@
         <w:rPr>
           <w:rFonts w:ascii="Times New Roman" w:hAnsi="Times New Roman" w:cs="Times New Roman"/>
         </w:rPr>
-        <w:t xml:space="preserve"> to use. </w:t>
+        <w:t xml:space="preserve"> </w:t>
+      </w:r>
+      <w:r>
+        <w:rPr>
+          <w:rFonts w:ascii="Times New Roman" w:hAnsi="Times New Roman" w:cs="Times New Roman"/>
+        </w:rPr>
+        <w:t>for tasks</w:t>
+      </w:r>
+      <w:r>
+        <w:rPr>
+          <w:rFonts w:ascii="Times New Roman" w:hAnsi="Times New Roman" w:cs="Times New Roman"/>
+        </w:rPr>
+        <w:t>.</w:t>
+      </w:r>
+      <w:r>
+        <w:rPr>
+          <w:rFonts w:ascii="Times New Roman" w:hAnsi="Times New Roman" w:cs="Times New Roman"/>
+        </w:rPr>
+        <w:t xml:space="preserve"> </w:t>
       </w:r>
     </w:p>
     <w:p>
@@ -736,7 +794,19 @@
         <w:rPr>
           <w:rFonts w:ascii="Times New Roman" w:hAnsi="Times New Roman" w:cs="Times New Roman"/>
         </w:rPr>
-        <w:t xml:space="preserve">The final month of the semester I will create a basic website that will be able to use these models that were used and created to then be functional for users to try for themselves with a nice interface and no coding required. This will be a competency of using the skills of a data scientist to make multi-media functional art using the data and coding skills acquired throughout my degree. </w:t>
+        <w:t>The final month of the semester I will create a basic website that will be able to use these models that were used and created to then be functional for users to try for themselves with a nice interface</w:t>
+      </w:r>
+      <w:r>
+        <w:rPr>
+          <w:rFonts w:ascii="Times New Roman" w:hAnsi="Times New Roman" w:cs="Times New Roman"/>
+        </w:rPr>
+        <w:t xml:space="preserve"> so users have</w:t>
+      </w:r>
+      <w:r>
+        <w:rPr>
+          <w:rFonts w:ascii="Times New Roman" w:hAnsi="Times New Roman" w:cs="Times New Roman"/>
+        </w:rPr>
+        <w:t xml:space="preserve"> no coding required. This will be a competency of using the skills of a data scientist to make multi-media functional art using the data and coding skills acquired throughout my degree. </w:t>
       </w:r>
     </w:p>
     <w:p>

</xml_diff>

<commit_message>
Small Fixes - about to begin new .ipynb file for kyutai Moshi experiments
</commit_message>
<xml_diff>
--- a/Capstone_ProjectPlan.docx
+++ b/Capstone_ProjectPlan.docx
@@ -29,20 +29,8 @@
         </w:rPr>
         <w:t>12/30/2025</w:t>
       </w:r>
-    </w:p>
-    <w:p>
-      <w:pPr>
-        <w:spacing w:line="480" w:lineRule="auto"/>
-        <w:rPr>
-          <w:rFonts w:ascii="Times New Roman" w:hAnsi="Times New Roman" w:cs="Times New Roman"/>
-        </w:rPr>
-      </w:pPr>
-      <w:r>
-        <w:rPr>
-          <w:rFonts w:ascii="Times New Roman" w:hAnsi="Times New Roman" w:cs="Times New Roman"/>
-        </w:rPr>
-        <w:t xml:space="preserve">INFO 698 </w:t>
-      </w:r>
+      <w:bookmarkStart w:id="0" w:name="_GoBack"/>
+      <w:bookmarkEnd w:id="0"/>
     </w:p>
     <w:p>
       <w:pPr>
@@ -122,7 +110,19 @@
         <w:rPr>
           <w:rFonts w:ascii="Times New Roman" w:hAnsi="Times New Roman" w:cs="Times New Roman"/>
         </w:rPr>
-        <w:t xml:space="preserve"> Whisper(-small) for transcription and another model for translation while building my own model such as an </w:t>
+        <w:t xml:space="preserve"> Whisper(-small) for transcription and another model for translation while building my own model</w:t>
+      </w:r>
+      <w:r>
+        <w:rPr>
+          <w:rFonts w:ascii="Times New Roman" w:hAnsi="Times New Roman" w:cs="Times New Roman"/>
+        </w:rPr>
+        <w:t>s</w:t>
+      </w:r>
+      <w:r>
+        <w:rPr>
+          <w:rFonts w:ascii="Times New Roman" w:hAnsi="Times New Roman" w:cs="Times New Roman"/>
+        </w:rPr>
+        <w:t xml:space="preserve"> such as an </w:t>
       </w:r>
       <w:proofErr w:type="spellStart"/>
       <w:r>
@@ -190,7 +190,13 @@
         <w:rPr>
           <w:rFonts w:ascii="Times New Roman" w:hAnsi="Times New Roman" w:cs="Times New Roman"/>
         </w:rPr>
-        <w:t xml:space="preserve">. I hope to be able to have each model work together once individually created and in the end phase of the project put together a simple website that allows users to record audio directly to the site and have it become transcribed/captioned and then translated to a selected language with multiple options available. With more possible features with this projects potential if time allows. </w:t>
+        <w:t xml:space="preserve">. I hope to be able to have each model work together once individually created and in the end phase of the project put together a simple website that allows users to record audio directly to the site and have it become transcribed/captioned and then translated to a selected language with multiple options available. With more possible features </w:t>
+      </w:r>
+      <w:r>
+        <w:rPr>
+          <w:rFonts w:ascii="Times New Roman" w:hAnsi="Times New Roman" w:cs="Times New Roman"/>
+        </w:rPr>
+        <w:t xml:space="preserve">such as auto captioning videos, learning areas for chosen languages, and other ideas as time goes on. </w:t>
       </w:r>
     </w:p>
     <w:p>
@@ -410,8 +416,6 @@
           <w:rFonts w:ascii="Times New Roman" w:hAnsi="Times New Roman" w:cs="Times New Roman"/>
         </w:rPr>
       </w:pPr>
-      <w:bookmarkStart w:id="0" w:name="_GoBack"/>
-      <w:bookmarkEnd w:id="0"/>
     </w:p>
     <w:p>
       <w:pPr>

</xml_diff>